<commit_message>
Updated the yml file
</commit_message>
<xml_diff>
--- a/document.docx
+++ b/document.docx
@@ -170,7 +170,6 @@
         <w:t xml:space="preserve">The project contains app.py, </w:t>
       </w:r>
       <w:proofErr w:type="spellStart"/>
-      <w:proofErr w:type="gramStart"/>
       <w:r>
         <w:rPr>
           <w:rFonts w:ascii="Times New Roman" w:hAnsi="Times New Roman" w:cs="Times New Roman"/>
@@ -178,26 +177,11 @@
         <w:t>data.json</w:t>
       </w:r>
       <w:proofErr w:type="spellEnd"/>
-      <w:proofErr w:type="gramEnd"/>
-      <w:r>
-        <w:rPr>
-          <w:rFonts w:ascii="Times New Roman" w:hAnsi="Times New Roman" w:cs="Times New Roman"/>
-        </w:rPr>
-        <w:t>, requirements.txt</w:t>
-      </w:r>
-      <w:proofErr w:type="gramStart"/>
-      <w:r>
-        <w:rPr>
-          <w:rFonts w:ascii="Times New Roman" w:hAnsi="Times New Roman" w:cs="Times New Roman"/>
-        </w:rPr>
-        <w:t>, .env</w:t>
-      </w:r>
-      <w:proofErr w:type="gramEnd"/>
-      <w:r>
-        <w:rPr>
-          <w:rFonts w:ascii="Times New Roman" w:hAnsi="Times New Roman" w:cs="Times New Roman"/>
-        </w:rPr>
-        <w:t>, and a templates directory containing index.html and success.html. A screenshots folder and this documentation file are also included in the submission.</w:t>
+      <w:r>
+        <w:rPr>
+          <w:rFonts w:ascii="Times New Roman" w:hAnsi="Times New Roman" w:cs="Times New Roman"/>
+        </w:rPr>
+        <w:t>, requirements.txt, .env, and a templates directory containing index.html and success.html. A screenshots folder and this documentation file are also included in the submission.</w:t>
       </w:r>
     </w:p>
     <w:p>
@@ -235,7 +219,6 @@
         <w:t xml:space="preserve"> reads a JSON list from </w:t>
       </w:r>
       <w:proofErr w:type="spellStart"/>
-      <w:proofErr w:type="gramStart"/>
       <w:r>
         <w:rPr>
           <w:rFonts w:ascii="Times New Roman" w:hAnsi="Times New Roman" w:cs="Times New Roman"/>
@@ -243,7 +226,6 @@
         <w:t>data.json</w:t>
       </w:r>
       <w:proofErr w:type="spellEnd"/>
-      <w:proofErr w:type="gramEnd"/>
       <w:r>
         <w:rPr>
           <w:rFonts w:ascii="Times New Roman" w:hAnsi="Times New Roman" w:cs="Times New Roman"/>
@@ -311,7 +293,54 @@
         <w:rPr>
           <w:rFonts w:ascii="Times New Roman" w:hAnsi="Times New Roman" w:cs="Times New Roman"/>
         </w:rPr>
-        <w:t xml:space="preserve"> Insert your actual API browser screenshot here.</w:t>
+        <w:t xml:space="preserve"> </w:t>
+      </w:r>
+    </w:p>
+    <w:p>
+      <w:pPr>
+        <w:rPr>
+          <w:rFonts w:ascii="Times New Roman" w:hAnsi="Times New Roman" w:cs="Times New Roman"/>
+        </w:rPr>
+      </w:pPr>
+      <w:r>
+        <w:rPr>
+          <w:rFonts w:ascii="Times New Roman" w:hAnsi="Times New Roman" w:cs="Times New Roman"/>
+        </w:rPr>
+        <w:drawing>
+          <wp:inline distT="0" distB="0" distL="0" distR="0" wp14:anchorId="594255EB" wp14:editId="613D33FF">
+            <wp:extent cx="2850585" cy="2565400"/>
+            <wp:effectExtent l="0" t="0" r="6985" b="6350"/>
+            <wp:docPr id="411741992" name="Picture 1"/>
+            <wp:cNvGraphicFramePr>
+              <a:graphicFrameLocks xmlns:a="http://schemas.openxmlformats.org/drawingml/2006/main" noChangeAspect="1"/>
+            </wp:cNvGraphicFramePr>
+            <a:graphic xmlns:a="http://schemas.openxmlformats.org/drawingml/2006/main">
+              <a:graphicData uri="http://schemas.openxmlformats.org/drawingml/2006/picture">
+                <pic:pic xmlns:pic="http://schemas.openxmlformats.org/drawingml/2006/picture">
+                  <pic:nvPicPr>
+                    <pic:cNvPr id="411741992" name=""/>
+                    <pic:cNvPicPr/>
+                  </pic:nvPicPr>
+                  <pic:blipFill>
+                    <a:blip r:embed="rId5"/>
+                    <a:stretch>
+                      <a:fillRect/>
+                    </a:stretch>
+                  </pic:blipFill>
+                  <pic:spPr>
+                    <a:xfrm>
+                      <a:off x="0" y="0"/>
+                      <a:ext cx="2867772" cy="2580868"/>
+                    </a:xfrm>
+                    <a:prstGeom prst="rect">
+                      <a:avLst/>
+                    </a:prstGeom>
+                  </pic:spPr>
+                </pic:pic>
+              </a:graphicData>
+            </a:graphic>
+          </wp:inline>
+        </w:drawing>
       </w:r>
     </w:p>
     <w:p>
@@ -319,6 +348,7 @@
         <w:pStyle w:val="Heading2"/>
       </w:pPr>
       <w:r>
+        <w:lastRenderedPageBreak/>
         <w:t>5. Task 2: Frontend Form and MongoDB Atlas</w:t>
       </w:r>
     </w:p>
@@ -364,51 +394,11 @@
     </w:p>
     <w:p>
       <w:pPr>
-        <w:rPr>
-          <w:rFonts w:ascii="Times New Roman" w:hAnsi="Times New Roman" w:cs="Times New Roman"/>
-        </w:rPr>
-      </w:pPr>
-      <w:r>
         <w:rPr>
           <w:rFonts w:ascii="Times New Roman" w:hAnsi="Times New Roman" w:cs="Times New Roman"/>
           <w:b/>
           <w:bCs/>
         </w:rPr>
-        <w:t>Screenshot:</w:t>
-      </w:r>
-      <w:r>
-        <w:rPr>
-          <w:rFonts w:ascii="Times New Roman" w:hAnsi="Times New Roman" w:cs="Times New Roman"/>
-        </w:rPr>
-        <w:t xml:space="preserve"> Insert your actual frontend form screenshot here.</w:t>
-      </w:r>
-    </w:p>
-    <w:p>
-      <w:pPr>
-        <w:pStyle w:val="Heading2"/>
-      </w:pPr>
-      <w:r>
-        <w:t>6. Success Handling</w:t>
-      </w:r>
-    </w:p>
-    <w:p>
-      <w:pPr>
-        <w:rPr>
-          <w:rFonts w:ascii="Times New Roman" w:hAnsi="Times New Roman" w:cs="Times New Roman"/>
-        </w:rPr>
-      </w:pPr>
-      <w:r>
-        <w:rPr>
-          <w:rFonts w:ascii="Times New Roman" w:hAnsi="Times New Roman" w:cs="Times New Roman"/>
-        </w:rPr>
-        <w:t>When data is inserted successfully, Flask redirects the user to a confirmation page displaying “Data submitted successfully”.</w:t>
-      </w:r>
-    </w:p>
-    <w:p>
-      <w:pPr>
-        <w:rPr>
-          <w:rFonts w:ascii="Times New Roman" w:hAnsi="Times New Roman" w:cs="Times New Roman"/>
-        </w:rPr>
       </w:pPr>
       <w:r>
         <w:rPr>
@@ -418,11 +408,58 @@
         </w:rPr>
         <w:t>Screenshot:</w:t>
       </w:r>
-      <w:r>
-        <w:rPr>
-          <w:rFonts w:ascii="Times New Roman" w:hAnsi="Times New Roman" w:cs="Times New Roman"/>
-        </w:rPr>
-        <w:t xml:space="preserve"> Insert your actual success page screenshot here.</w:t>
+    </w:p>
+    <w:p>
+      <w:pPr>
+        <w:rPr>
+          <w:rFonts w:ascii="Times New Roman" w:hAnsi="Times New Roman" w:cs="Times New Roman"/>
+        </w:rPr>
+      </w:pPr>
+      <w:r>
+        <w:rPr>
+          <w:rFonts w:ascii="Times New Roman" w:hAnsi="Times New Roman" w:cs="Times New Roman"/>
+        </w:rPr>
+        <w:t xml:space="preserve"> </w:t>
+      </w:r>
+      <w:r>
+        <w:rPr>
+          <w:rFonts w:ascii="Times New Roman" w:hAnsi="Times New Roman" w:cs="Times New Roman"/>
+        </w:rPr>
+        <w:drawing>
+          <wp:inline distT="0" distB="0" distL="0" distR="0" wp14:anchorId="5754A0D5" wp14:editId="39E7AFA6">
+            <wp:extent cx="3752850" cy="2688863"/>
+            <wp:effectExtent l="0" t="0" r="0" b="0"/>
+            <wp:docPr id="829456943" name="Picture 1"/>
+            <wp:cNvGraphicFramePr>
+              <a:graphicFrameLocks xmlns:a="http://schemas.openxmlformats.org/drawingml/2006/main" noChangeAspect="1"/>
+            </wp:cNvGraphicFramePr>
+            <a:graphic xmlns:a="http://schemas.openxmlformats.org/drawingml/2006/main">
+              <a:graphicData uri="http://schemas.openxmlformats.org/drawingml/2006/picture">
+                <pic:pic xmlns:pic="http://schemas.openxmlformats.org/drawingml/2006/picture">
+                  <pic:nvPicPr>
+                    <pic:cNvPr id="829456943" name=""/>
+                    <pic:cNvPicPr/>
+                  </pic:nvPicPr>
+                  <pic:blipFill>
+                    <a:blip r:embed="rId6"/>
+                    <a:stretch>
+                      <a:fillRect/>
+                    </a:stretch>
+                  </pic:blipFill>
+                  <pic:spPr>
+                    <a:xfrm>
+                      <a:off x="0" y="0"/>
+                      <a:ext cx="3768609" cy="2700154"/>
+                    </a:xfrm>
+                    <a:prstGeom prst="rect">
+                      <a:avLst/>
+                    </a:prstGeom>
+                  </pic:spPr>
+                </pic:pic>
+              </a:graphicData>
+            </a:graphic>
+          </wp:inline>
+        </w:drawing>
       </w:r>
     </w:p>
     <w:p>
@@ -430,21 +467,20 @@
         <w:pStyle w:val="Heading2"/>
       </w:pPr>
       <w:r>
-        <w:lastRenderedPageBreak/>
-        <w:t>7. Error Handling</w:t>
-      </w:r>
-    </w:p>
-    <w:p>
-      <w:pPr>
-        <w:rPr>
-          <w:rFonts w:ascii="Times New Roman" w:hAnsi="Times New Roman" w:cs="Times New Roman"/>
-        </w:rPr>
-      </w:pPr>
-      <w:r>
-        <w:rPr>
-          <w:rFonts w:ascii="Times New Roman" w:hAnsi="Times New Roman" w:cs="Times New Roman"/>
-        </w:rPr>
-        <w:t>The application displays validation errors on the original form page when required fields are missing or the email address is invalid. If the database is unavailable or an insertion fails, an error message is displayed without redirecting to the success page.</w:t>
+        <w:t>6. Success Handling</w:t>
+      </w:r>
+    </w:p>
+    <w:p>
+      <w:pPr>
+        <w:rPr>
+          <w:rFonts w:ascii="Times New Roman" w:hAnsi="Times New Roman" w:cs="Times New Roman"/>
+        </w:rPr>
+      </w:pPr>
+      <w:r>
+        <w:rPr>
+          <w:rFonts w:ascii="Times New Roman" w:hAnsi="Times New Roman" w:cs="Times New Roman"/>
+        </w:rPr>
+        <w:t>When data is inserted successfully, Flask redirects the user to a confirmation page displaying “Data submitted successfully”.</w:t>
       </w:r>
     </w:p>
     <w:p>
@@ -465,42 +501,82 @@
         <w:rPr>
           <w:rFonts w:ascii="Times New Roman" w:hAnsi="Times New Roman" w:cs="Times New Roman"/>
         </w:rPr>
-        <w:t xml:space="preserve"> Insert your actual error handling screenshot here.</w:t>
-      </w:r>
+        <w:t xml:space="preserve"> </w:t>
+      </w:r>
+    </w:p>
+    <w:p>
+      <w:pPr>
+        <w:rPr>
+          <w:rFonts w:ascii="Times New Roman" w:hAnsi="Times New Roman" w:cs="Times New Roman"/>
+        </w:rPr>
+      </w:pPr>
+      <w:r>
+        <w:rPr>
+          <w:rFonts w:ascii="Times New Roman" w:hAnsi="Times New Roman" w:cs="Times New Roman"/>
+        </w:rPr>
+        <w:drawing>
+          <wp:inline distT="0" distB="0" distL="0" distR="0" wp14:anchorId="3CF069AA" wp14:editId="4133FEFD">
+            <wp:extent cx="2419350" cy="2023262"/>
+            <wp:effectExtent l="0" t="0" r="0" b="0"/>
+            <wp:docPr id="121006640" name="Picture 1"/>
+            <wp:cNvGraphicFramePr>
+              <a:graphicFrameLocks xmlns:a="http://schemas.openxmlformats.org/drawingml/2006/main" noChangeAspect="1"/>
+            </wp:cNvGraphicFramePr>
+            <a:graphic xmlns:a="http://schemas.openxmlformats.org/drawingml/2006/main">
+              <a:graphicData uri="http://schemas.openxmlformats.org/drawingml/2006/picture">
+                <pic:pic xmlns:pic="http://schemas.openxmlformats.org/drawingml/2006/picture">
+                  <pic:nvPicPr>
+                    <pic:cNvPr id="121006640" name=""/>
+                    <pic:cNvPicPr/>
+                  </pic:nvPicPr>
+                  <pic:blipFill>
+                    <a:blip r:embed="rId7"/>
+                    <a:stretch>
+                      <a:fillRect/>
+                    </a:stretch>
+                  </pic:blipFill>
+                  <pic:spPr>
+                    <a:xfrm>
+                      <a:off x="0" y="0"/>
+                      <a:ext cx="2425496" cy="2028401"/>
+                    </a:xfrm>
+                    <a:prstGeom prst="rect">
+                      <a:avLst/>
+                    </a:prstGeom>
+                  </pic:spPr>
+                </pic:pic>
+              </a:graphicData>
+            </a:graphic>
+          </wp:inline>
+        </w:drawing>
+      </w:r>
+    </w:p>
+    <w:p>
+      <w:pPr>
+        <w:rPr>
+          <w:rFonts w:ascii="Times New Roman" w:hAnsi="Times New Roman" w:cs="Times New Roman"/>
+        </w:rPr>
+      </w:pPr>
     </w:p>
     <w:p>
       <w:pPr>
         <w:pStyle w:val="Heading2"/>
       </w:pPr>
       <w:r>
-        <w:t>8. Database Verification</w:t>
-      </w:r>
-    </w:p>
-    <w:p>
-      <w:pPr>
-        <w:rPr>
-          <w:rFonts w:ascii="Times New Roman" w:hAnsi="Times New Roman" w:cs="Times New Roman"/>
-        </w:rPr>
-      </w:pPr>
-      <w:r>
-        <w:rPr>
-          <w:rFonts w:ascii="Times New Roman" w:hAnsi="Times New Roman" w:cs="Times New Roman"/>
-        </w:rPr>
-        <w:t xml:space="preserve">After a successful submission, the inserted document can be verified in MongoDB Atlas under the </w:t>
-      </w:r>
-      <w:proofErr w:type="spellStart"/>
-      <w:r>
-        <w:rPr>
-          <w:rFonts w:ascii="Times New Roman" w:hAnsi="Times New Roman" w:cs="Times New Roman"/>
-        </w:rPr>
-        <w:t>flask_assignment</w:t>
-      </w:r>
-      <w:proofErr w:type="spellEnd"/>
-      <w:r>
-        <w:rPr>
-          <w:rFonts w:ascii="Times New Roman" w:hAnsi="Times New Roman" w:cs="Times New Roman"/>
-        </w:rPr>
-        <w:t xml:space="preserve"> database and submissions collection.</w:t>
+        <w:t>7. Error Handling</w:t>
+      </w:r>
+    </w:p>
+    <w:p>
+      <w:pPr>
+        <w:rPr>
+          <w:rFonts w:ascii="Times New Roman" w:hAnsi="Times New Roman" w:cs="Times New Roman"/>
+        </w:rPr>
+      </w:pPr>
+      <w:r>
+        <w:rPr>
+          <w:rFonts w:ascii="Times New Roman" w:hAnsi="Times New Roman" w:cs="Times New Roman"/>
+        </w:rPr>
+        <w:t>The application displays validation errors on the original form page when required fields are missing or the email address is invalid. If the database is unavailable or an insertion fails, an error message is displayed without redirecting to the success page.</w:t>
       </w:r>
     </w:p>
     <w:p>
@@ -515,13 +591,164 @@
           <w:b/>
           <w:bCs/>
         </w:rPr>
+        <w:lastRenderedPageBreak/>
         <w:t>Screenshot:</w:t>
       </w:r>
       <w:r>
         <w:rPr>
           <w:rFonts w:ascii="Times New Roman" w:hAnsi="Times New Roman" w:cs="Times New Roman"/>
         </w:rPr>
-        <w:t xml:space="preserve"> Insert your actual MongoDB Atlas screenshot here.</w:t>
+        <w:t xml:space="preserve"> </w:t>
+      </w:r>
+    </w:p>
+    <w:p>
+      <w:pPr>
+        <w:rPr>
+          <w:rFonts w:ascii="Times New Roman" w:hAnsi="Times New Roman" w:cs="Times New Roman"/>
+        </w:rPr>
+      </w:pPr>
+      <w:r>
+        <w:rPr>
+          <w:rFonts w:ascii="Times New Roman" w:hAnsi="Times New Roman" w:cs="Times New Roman"/>
+        </w:rPr>
+        <w:drawing>
+          <wp:inline distT="0" distB="0" distL="0" distR="0" wp14:anchorId="1F83B706" wp14:editId="4761B69D">
+            <wp:extent cx="2438400" cy="2710955"/>
+            <wp:effectExtent l="0" t="0" r="0" b="0"/>
+            <wp:docPr id="1611277516" name="Picture 1"/>
+            <wp:cNvGraphicFramePr>
+              <a:graphicFrameLocks xmlns:a="http://schemas.openxmlformats.org/drawingml/2006/main" noChangeAspect="1"/>
+            </wp:cNvGraphicFramePr>
+            <a:graphic xmlns:a="http://schemas.openxmlformats.org/drawingml/2006/main">
+              <a:graphicData uri="http://schemas.openxmlformats.org/drawingml/2006/picture">
+                <pic:pic xmlns:pic="http://schemas.openxmlformats.org/drawingml/2006/picture">
+                  <pic:nvPicPr>
+                    <pic:cNvPr id="1611277516" name=""/>
+                    <pic:cNvPicPr/>
+                  </pic:nvPicPr>
+                  <pic:blipFill>
+                    <a:blip r:embed="rId8"/>
+                    <a:stretch>
+                      <a:fillRect/>
+                    </a:stretch>
+                  </pic:blipFill>
+                  <pic:spPr>
+                    <a:xfrm>
+                      <a:off x="0" y="0"/>
+                      <a:ext cx="2450770" cy="2724708"/>
+                    </a:xfrm>
+                    <a:prstGeom prst="rect">
+                      <a:avLst/>
+                    </a:prstGeom>
+                  </pic:spPr>
+                </pic:pic>
+              </a:graphicData>
+            </a:graphic>
+          </wp:inline>
+        </w:drawing>
+      </w:r>
+    </w:p>
+    <w:p>
+      <w:pPr>
+        <w:pStyle w:val="Heading2"/>
+      </w:pPr>
+      <w:r>
+        <w:t>8. Database Verification</w:t>
+      </w:r>
+    </w:p>
+    <w:p>
+      <w:pPr>
+        <w:rPr>
+          <w:rFonts w:ascii="Times New Roman" w:hAnsi="Times New Roman" w:cs="Times New Roman"/>
+        </w:rPr>
+      </w:pPr>
+      <w:r>
+        <w:rPr>
+          <w:rFonts w:ascii="Times New Roman" w:hAnsi="Times New Roman" w:cs="Times New Roman"/>
+        </w:rPr>
+        <w:t xml:space="preserve">After a successful submission, the inserted document can be verified in MongoDB Atlas under the </w:t>
+      </w:r>
+      <w:proofErr w:type="spellStart"/>
+      <w:r>
+        <w:rPr>
+          <w:rFonts w:ascii="Times New Roman" w:hAnsi="Times New Roman" w:cs="Times New Roman"/>
+        </w:rPr>
+        <w:t>flask_assignment</w:t>
+      </w:r>
+      <w:proofErr w:type="spellEnd"/>
+      <w:r>
+        <w:rPr>
+          <w:rFonts w:ascii="Times New Roman" w:hAnsi="Times New Roman" w:cs="Times New Roman"/>
+        </w:rPr>
+        <w:t xml:space="preserve"> database and submissions collection.</w:t>
+      </w:r>
+    </w:p>
+    <w:p>
+      <w:pPr>
+        <w:rPr>
+          <w:rFonts w:ascii="Times New Roman" w:hAnsi="Times New Roman" w:cs="Times New Roman"/>
+        </w:rPr>
+      </w:pPr>
+      <w:r>
+        <w:rPr>
+          <w:rFonts w:ascii="Times New Roman" w:hAnsi="Times New Roman" w:cs="Times New Roman"/>
+          <w:b/>
+          <w:bCs/>
+        </w:rPr>
+        <w:t>Screenshot:</w:t>
+      </w:r>
+      <w:r>
+        <w:rPr>
+          <w:rFonts w:ascii="Times New Roman" w:hAnsi="Times New Roman" w:cs="Times New Roman"/>
+        </w:rPr>
+        <w:t xml:space="preserve"> </w:t>
+      </w:r>
+    </w:p>
+    <w:p>
+      <w:pPr>
+        <w:rPr>
+          <w:rFonts w:ascii="Times New Roman" w:hAnsi="Times New Roman" w:cs="Times New Roman"/>
+        </w:rPr>
+      </w:pPr>
+      <w:r>
+        <w:rPr>
+          <w:rFonts w:ascii="Times New Roman" w:hAnsi="Times New Roman" w:cs="Times New Roman"/>
+        </w:rPr>
+        <w:drawing>
+          <wp:inline distT="0" distB="0" distL="0" distR="0" wp14:anchorId="207094F9" wp14:editId="1D5118BC">
+            <wp:extent cx="3094767" cy="2597150"/>
+            <wp:effectExtent l="0" t="0" r="0" b="0"/>
+            <wp:docPr id="1238079573" name="Picture 1"/>
+            <wp:cNvGraphicFramePr>
+              <a:graphicFrameLocks xmlns:a="http://schemas.openxmlformats.org/drawingml/2006/main" noChangeAspect="1"/>
+            </wp:cNvGraphicFramePr>
+            <a:graphic xmlns:a="http://schemas.openxmlformats.org/drawingml/2006/main">
+              <a:graphicData uri="http://schemas.openxmlformats.org/drawingml/2006/picture">
+                <pic:pic xmlns:pic="http://schemas.openxmlformats.org/drawingml/2006/picture">
+                  <pic:nvPicPr>
+                    <pic:cNvPr id="1238079573" name=""/>
+                    <pic:cNvPicPr/>
+                  </pic:nvPicPr>
+                  <pic:blipFill>
+                    <a:blip r:embed="rId9"/>
+                    <a:stretch>
+                      <a:fillRect/>
+                    </a:stretch>
+                  </pic:blipFill>
+                  <pic:spPr>
+                    <a:xfrm>
+                      <a:off x="0" y="0"/>
+                      <a:ext cx="3100145" cy="2601663"/>
+                    </a:xfrm>
+                    <a:prstGeom prst="rect">
+                      <a:avLst/>
+                    </a:prstGeom>
+                  </pic:spPr>
+                </pic:pic>
+              </a:graphicData>
+            </a:graphic>
+          </wp:inline>
+        </w:drawing>
       </w:r>
     </w:p>
     <w:p>
@@ -586,21 +813,7 @@
         <w:rPr>
           <w:rFonts w:ascii="Times New Roman" w:hAnsi="Times New Roman" w:cs="Times New Roman"/>
         </w:rPr>
-        <w:t>Activate the environment</w:t>
-      </w:r>
-      <w:proofErr w:type="gramStart"/>
-      <w:r>
-        <w:rPr>
-          <w:rFonts w:ascii="Times New Roman" w:hAnsi="Times New Roman" w:cs="Times New Roman"/>
-        </w:rPr>
-        <w:t>: .</w:t>
-      </w:r>
-      <w:proofErr w:type="gramEnd"/>
-      <w:r>
-        <w:rPr>
-          <w:rFonts w:ascii="Times New Roman" w:hAnsi="Times New Roman" w:cs="Times New Roman"/>
-        </w:rPr>
-        <w:t>\env\Scripts\</w:t>
+        <w:t>Activate the environment: .\env\Scripts\</w:t>
       </w:r>
       <w:r>
         <w:rPr>
@@ -687,6 +900,7 @@
         <w:rPr>
           <w:rFonts w:ascii="Times New Roman" w:hAnsi="Times New Roman" w:cs="Times New Roman"/>
         </w:rPr>
+        <w:lastRenderedPageBreak/>
         <w:t>This project demonstrates how to create a Flask JSON API, develop an HTML form, connect a Python application to MongoDB Atlas, insert data into a collection, and implement success and error handling. GitHub provides version control and a convenient way to share the project source code.</w:t>
       </w:r>
     </w:p>
@@ -725,7 +939,13 @@
         <w:rPr>
           <w:rFonts w:ascii="Times New Roman" w:hAnsi="Times New Roman" w:cs="Times New Roman"/>
         </w:rPr>
-        <w:t xml:space="preserve"> Add your actual public GitHub repository URL here after uploading your project.</w:t>
+        <w:t xml:space="preserve"> </w:t>
+      </w:r>
+      <w:r>
+        <w:rPr>
+          <w:rFonts w:ascii="Times New Roman" w:hAnsi="Times New Roman" w:cs="Times New Roman"/>
+        </w:rPr>
+        <w:t>https://github.com/krishna-280792shinde/Flask-and-Mongo-Assignment</w:t>
       </w:r>
     </w:p>
     <w:sectPr>
@@ -1925,6 +2145,29 @@
       <w:spacing w:val="5"/>
     </w:rPr>
   </w:style>
+  <w:style w:type="character" w:styleId="Hyperlink">
+    <w:name w:val="Hyperlink"/>
+    <w:basedOn w:val="DefaultParagraphFont"/>
+    <w:uiPriority w:val="99"/>
+    <w:unhideWhenUsed/>
+    <w:rsid w:val="00225E3D"/>
+    <w:rPr>
+      <w:color w:val="0563C1" w:themeColor="hyperlink"/>
+      <w:u w:val="single"/>
+    </w:rPr>
+  </w:style>
+  <w:style w:type="character" w:styleId="UnresolvedMention">
+    <w:name w:val="Unresolved Mention"/>
+    <w:basedOn w:val="DefaultParagraphFont"/>
+    <w:uiPriority w:val="99"/>
+    <w:semiHidden/>
+    <w:unhideWhenUsed/>
+    <w:rsid w:val="00225E3D"/>
+    <w:rPr>
+      <w:color w:val="605E5C"/>
+      <w:shd w:val="clear" w:color="auto" w:fill="E1DFDD"/>
+    </w:rPr>
+  </w:style>
 </w:styles>
 </file>
 

</xml_diff>